<commit_message>
Adição de uma atividade
somente uma pois estou na correria pra viajar amanha
</commit_message>
<xml_diff>
--- a/memento_de_python.docx
+++ b/memento_de_python.docx
@@ -3122,8 +3122,17 @@
           <w:sz w:val="28"/>
           <w:szCs w:val="28"/>
         </w:rPr>
-        <w:t xml:space="preserve">serir um valor em qualquer </w:t>
-      </w:r>
+        <w:t>serir um valor em qualquer lugar</w:t>
+      </w:r>
+      <w:r>
+        <w:rPr>
+          <w:rFonts w:ascii="Times New Roman" w:hAnsi="Times New Roman" w:cs="Times New Roman"/>
+          <w:sz w:val="28"/>
+          <w:szCs w:val="28"/>
+        </w:rPr>
+        <w:t xml:space="preserve"> </w:t>
+      </w:r>
+      <w:proofErr w:type="spellStart"/>
       <w:proofErr w:type="gramStart"/>
       <w:r>
         <w:rPr>
@@ -3131,32 +3140,15 @@
           <w:sz w:val="28"/>
           <w:szCs w:val="28"/>
         </w:rPr>
-        <w:t>lugar</w:t>
-      </w:r>
-      <w:r>
-        <w:rPr>
-          <w:rFonts w:ascii="Times New Roman" w:hAnsi="Times New Roman" w:cs="Times New Roman"/>
-          <w:sz w:val="28"/>
-          <w:szCs w:val="28"/>
-        </w:rPr>
-        <w:t xml:space="preserve"> </w:t>
-      </w:r>
-      <w:r>
-        <w:rPr>
-          <w:rFonts w:ascii="Times New Roman" w:hAnsi="Times New Roman" w:cs="Times New Roman"/>
-          <w:sz w:val="28"/>
-          <w:szCs w:val="28"/>
-        </w:rPr>
-        <w:t>.</w:t>
-      </w:r>
-      <w:proofErr w:type="spellStart"/>
-      <w:r>
-        <w:rPr>
-          <w:rFonts w:ascii="Times New Roman" w:hAnsi="Times New Roman" w:cs="Times New Roman"/>
-          <w:sz w:val="28"/>
-          <w:szCs w:val="28"/>
-        </w:rPr>
-        <w:t>insert</w:t>
+        <w:t>variavel</w:t>
+      </w:r>
+      <w:r>
+        <w:rPr>
+          <w:rFonts w:ascii="Times New Roman" w:hAnsi="Times New Roman" w:cs="Times New Roman"/>
+          <w:sz w:val="28"/>
+          <w:szCs w:val="28"/>
+        </w:rPr>
+        <w:t>.insert</w:t>
       </w:r>
       <w:proofErr w:type="spellEnd"/>
       <w:proofErr w:type="gramEnd"/>

</xml_diff>